<commit_message>
updated the SRS design and implementation constrains
</commit_message>
<xml_diff>
--- a/SRS.docx
+++ b/SRS.docx
@@ -1452,6 +1452,7 @@
           <w:iCs/>
           <w:sz w:val="24"/>
           <w:szCs w:val="24"/>
+          <w:lang w:val="en-IN"/>
         </w:rPr>
       </w:pPr>
       <w:r>
@@ -1461,19 +1462,23 @@
           <w:iCs/>
           <w:sz w:val="24"/>
           <w:szCs w:val="24"/>
-        </w:rPr>
+          <w:lang w:val="en-IN"/>
+        </w:rPr>
+        <w:lastRenderedPageBreak/>
         <w:t>2.4 Operating Environment</w:t>
       </w:r>
     </w:p>
     <w:p>
       <w:pPr>
-        <w:spacing w:after="100"/>
-        <w:rPr>
-          <w:rFonts w:ascii="Times New Roman" w:hAnsi="Times New Roman" w:cs="Times New Roman"/>
-          <w:i/>
-          <w:iCs/>
-          <w:sz w:val="24"/>
-          <w:szCs w:val="24"/>
+        <w:pStyle w:val="Heading2"/>
+        <w:rPr>
+          <w:rFonts w:ascii="Times New Roman" w:hAnsi="Times New Roman" w:cs="Times New Roman"/>
+          <w:i/>
+          <w:iCs/>
+          <w:color w:val="000000" w:themeColor="text1"/>
+          <w:sz w:val="24"/>
+          <w:szCs w:val="24"/>
+          <w:lang w:val="en-IN"/>
         </w:rPr>
       </w:pPr>
       <w:r>
@@ -1481,39 +1486,62 @@
           <w:rFonts w:ascii="Times New Roman" w:hAnsi="Times New Roman" w:cs="Times New Roman"/>
           <w:i/>
           <w:iCs/>
-          <w:sz w:val="24"/>
-          <w:szCs w:val="24"/>
-        </w:rPr>
-        <w:t>The system will operate as a web application accessible through modern browsers such as Google Chrome, Microsoft Edge, and Mozilla Firefox. Development can be performed on Windows or Linux. The planned implementation uses the MERN stack: React for the front end, Node.js and Express.js for the backend, and MongoDB for persistent storage.</w:t>
+          <w:color w:val="000000" w:themeColor="text1"/>
+          <w:sz w:val="24"/>
+          <w:szCs w:val="24"/>
+          <w:lang w:val="en-IN"/>
+        </w:rPr>
+        <w:t>The application will be developed as a browser-based system that can be accessed using commonly used web browsers, including Google Chrome, Microsoft Edge, and Mozilla Firefox. The development and testing of the application can be carried out on either Windows or Linux operating systems. The system will be built using the MERN technology stack, where React will be used to create the user interface, Node.js with Express.js will handle server-side operations, and MongoDB will be used for storing and managing application data.</w:t>
       </w:r>
     </w:p>
     <w:p>
       <w:pPr>
         <w:pStyle w:val="Heading2"/>
+        <w:rPr>
+          <w:rFonts w:ascii="Times New Roman" w:hAnsi="Times New Roman" w:cs="Times New Roman"/>
+          <w:i/>
+          <w:iCs/>
+          <w:sz w:val="24"/>
+          <w:szCs w:val="24"/>
+          <w:lang w:val="en-IN"/>
+        </w:rPr>
       </w:pPr>
       <w:r>
+        <w:rPr>
+          <w:rFonts w:ascii="Times New Roman" w:hAnsi="Times New Roman" w:cs="Times New Roman"/>
+          <w:i/>
+          <w:iCs/>
+          <w:sz w:val="24"/>
+          <w:szCs w:val="24"/>
+          <w:lang w:val="en-IN"/>
+        </w:rPr>
         <w:t>2.5 Design and Implementation Constraints</w:t>
       </w:r>
     </w:p>
     <w:p>
       <w:pPr>
-        <w:spacing w:after="100"/>
+        <w:pStyle w:val="Heading2"/>
+        <w:rPr>
+          <w:rFonts w:ascii="Times New Roman" w:hAnsi="Times New Roman" w:cs="Times New Roman"/>
+          <w:i/>
+          <w:iCs/>
+          <w:color w:val="000000" w:themeColor="text1"/>
+          <w:sz w:val="24"/>
+          <w:szCs w:val="24"/>
+          <w:lang w:val="en-IN"/>
+        </w:rPr>
       </w:pPr>
       <w:r>
         <w:rPr>
           <w:rFonts w:ascii="Times New Roman" w:hAnsi="Times New Roman" w:cs="Times New Roman"/>
           <w:i/>
           <w:iCs/>
-          <w:sz w:val="24"/>
-          <w:szCs w:val="24"/>
-        </w:rPr>
-        <w:t>The project is constrained by the course technology options; this SRS assumes MERN is selected. The system shall use a client-server architecture, role-based access control, standard web protocols, and secure coding practices. The database shall support users, sellers, books, categories, carts, orders, order items, payments, and reviews. The implementation must remain feasible for a student mini-project</w:t>
-      </w:r>
-      <w:r>
-        <w:rPr>
-          <w:sz w:val="21"/>
-        </w:rPr>
-        <w:t>.</w:t>
+          <w:color w:val="000000" w:themeColor="text1"/>
+          <w:sz w:val="24"/>
+          <w:szCs w:val="24"/>
+          <w:lang w:val="en-IN"/>
+        </w:rPr>
+        <w:t>The development of the system will follow the technologies permitted for the course project, with MERN chosen as the primary development stack. The application will follow a client-server model and provide different levels of access based on user roles. Communication between the client and server will use standard web technologies, while appropriate security measures will be considered during implementation. The database design will maintain information related to customers, sellers, books, book categories, shopping carts, purchases, payment details, and customer reviews. The overall scope and features of the application will be kept manageable so that the project can be successfully implemented within the time and resources available for a student mini-project.</w:t>
       </w:r>
     </w:p>
     <w:p>
@@ -1521,7 +1549,6 @@
         <w:pStyle w:val="Heading2"/>
       </w:pPr>
       <w:r>
-        <w:lastRenderedPageBreak/>
         <w:t>2.6 Assumptions and Dependencies</w:t>
       </w:r>
     </w:p>
@@ -1618,6 +1645,7 @@
           <w:sz w:val="24"/>
           <w:szCs w:val="24"/>
         </w:rPr>
+        <w:lastRenderedPageBreak/>
         <w:t>3.2 Software Interfaces</w:t>
       </w:r>
     </w:p>
@@ -1744,7 +1772,6 @@
         <w:rPr>
           <w:noProof/>
         </w:rPr>
-        <w:lastRenderedPageBreak/>
         <w:drawing>
           <wp:inline distT="0" distB="0" distL="0" distR="0" wp14:anchorId="1DE12307" wp14:editId="07A3062D">
             <wp:extent cx="5485765" cy="2674620"/>
@@ -1798,6 +1825,7 @@
         <w:rPr>
           <w:noProof/>
         </w:rPr>
+        <w:lastRenderedPageBreak/>
         <w:drawing>
           <wp:inline distT="0" distB="0" distL="0" distR="0" wp14:anchorId="0BF3CFDC" wp14:editId="4A0EB51C">
             <wp:extent cx="5486400" cy="3672840"/>
@@ -1908,7 +1936,6 @@
           <w:sz w:val="24"/>
           <w:szCs w:val="24"/>
         </w:rPr>
-        <w:lastRenderedPageBreak/>
         <w:t>Stimulus/Response Sequences:</w:t>
       </w:r>
     </w:p>
@@ -2108,6 +2135,7 @@
           <w:sz w:val="24"/>
           <w:szCs w:val="24"/>
         </w:rPr>
+        <w:lastRenderedPageBreak/>
         <w:t>REQ-03: The system shall allow registered users to securely log in and log out using valid credentials.</w:t>
       </w:r>
     </w:p>
@@ -2435,7 +2463,6 @@
           <w:sz w:val="24"/>
           <w:szCs w:val="24"/>
         </w:rPr>
-        <w:lastRenderedPageBreak/>
         <w:t>• Customer selects Checkout → system validates availability and displays order summary.</w:t>
       </w:r>
     </w:p>
@@ -2610,6 +2637,7 @@
           <w:sz w:val="24"/>
           <w:szCs w:val="24"/>
         </w:rPr>
+        <w:lastRenderedPageBreak/>
         <w:t>• Payment is initiated → system records payment status.</w:t>
       </w:r>
     </w:p>
@@ -2903,7 +2931,6 @@
           <w:sz w:val="24"/>
           <w:szCs w:val="24"/>
         </w:rPr>
-        <w:lastRenderedPageBreak/>
         <w:t>5.6 Administrator Management</w:t>
       </w:r>
     </w:p>
@@ -3090,6 +3117,7 @@
         <w:pStyle w:val="Heading1"/>
       </w:pPr>
       <w:r>
+        <w:lastRenderedPageBreak/>
         <w:t>6. Other Nonfunctional Requirements</w:t>
       </w:r>
     </w:p>
@@ -3328,7 +3356,6 @@
         <w:pStyle w:val="Heading2"/>
       </w:pPr>
       <w:r>
-        <w:lastRenderedPageBreak/>
         <w:t>6.4 Software Quality Attributes</w:t>
       </w:r>
     </w:p>
@@ -3505,6 +3532,7 @@
           <w:sz w:val="24"/>
           <w:szCs w:val="24"/>
         </w:rPr>
+        <w:lastRenderedPageBreak/>
         <w:t>• Administrators have higher privileges than customers and sellers.</w:t>
       </w:r>
     </w:p>
@@ -3910,7 +3938,6 @@
               <w:spacing w:after="0"/>
             </w:pPr>
             <w:r>
-              <w:lastRenderedPageBreak/>
               <w:t>Order Item</w:t>
             </w:r>
           </w:p>
@@ -4396,6 +4423,7 @@
               <w:spacing w:after="0"/>
             </w:pPr>
             <w:r>
+              <w:lastRenderedPageBreak/>
               <w:t>Password</w:t>
             </w:r>
           </w:p>
@@ -5347,7 +5375,6 @@
           </w:tcPr>
           <w:p>
             <w:r>
-              <w:lastRenderedPageBreak/>
               <w:t>Rating</w:t>
             </w:r>
           </w:p>
@@ -6681,7 +6708,6 @@
               <w:spacing w:after="0"/>
             </w:pPr>
             <w:r>
-              <w:lastRenderedPageBreak/>
               <w:t>8</w:t>
             </w:r>
           </w:p>
@@ -7384,6 +7410,7 @@
               <w:spacing w:after="0"/>
             </w:pPr>
             <w:r>
+              <w:lastRenderedPageBreak/>
               <w:t>14</w:t>
             </w:r>
           </w:p>
@@ -8422,7 +8449,6 @@
   <w:style w:type="character" w:default="1" w:styleId="DefaultParagraphFont">
     <w:name w:val="Default Paragraph Font"/>
     <w:uiPriority w:val="1"/>
-    <w:semiHidden/>
     <w:unhideWhenUsed/>
   </w:style>
   <w:style w:type="table" w:default="1" w:styleId="TableNormal">

</xml_diff>